<commit_message>
fix(dossier): ausgelieferte Word-Vorlage nachziehen + Waechter-Test
Die Vorlage Export_Vorlage/Eigentuemerdossier.docx stammte noch vom alten
Stand (Logo_Hinweis, Autor, Kapitel 5) und wurde vom Export gelesen -
nicht der DossierWordTemplateBuilder zur Laufzeit. Mit
DossierWordTemplateBuilder.WriteTo(...) neu erzeugt: vier Kapitel, die
acht neuen Platzhalter (@Logo, @Wappen, @Uebersichtsplan, #Eigentuemer,
Autoren etc.), kein Logo_Hinweis/Autor/Kapitel 5 mehr.

Neuer Waechter-Test AusgelieferteDossierWordVorlageTests vergleicht den
Text aus word/document.xml der ausgelieferten Datei mit dem Text, den
DossierWordTemplateBuilder.Build() heute erzeugt (Textvergleich statt
Bytevergleich, da die ZIP-Huelle Zeitstempel traegt). Damit kann die
ausgelieferte Vorlage nie mehr still hinter dem Bauer zurueckbleiben.

Co-Authored-By: Claude Opus 5 (1M context) <noreply@anthropic.com>
</commit_message>
<xml_diff>
--- a/Export_Vorlage/Eigentuemerdossier.docx
+++ b/Export_Vorlage/Eigentuemerdossier.docx
@@ -22,20 +22,70 @@
           <w:tcPr>
             <w:tcW w:w="5000" w:type="pct"/>
           </w:tcPr>
-          <w:p>
-            <w:pPr>
-              <w:spacing w:after="60" w:line="240" w:lineRule="auto"/>
-            </w:pPr>
-            <w:r>
-              <w:rPr>
-                <w:i/>
-                <w:color w:val="808080"/>
-                <w:sz w:val="18"/>
-                <w:rFonts w:ascii="Arial" w:hAnsi="Arial"/>
-              </w:rPr>
-              <w:t xml:space="preserve">{{Logo_Hinweis}}</w:t>
-            </w:r>
-          </w:p>
+          <w:tbl>
+            <w:tblPr>
+              <w:tblW w:w="5000" w:type="pct"/>
+              <w:tblBorders>
+                <w:top w:val="none"/>
+                <w:left w:val="none"/>
+                <w:bottom w:val="none"/>
+                <w:right w:val="none"/>
+                <w:insideH w:val="none"/>
+                <w:insideV w:val="none"/>
+              </w:tblBorders>
+            </w:tblPr>
+            <w:tblGrid>
+              <w:gridCol w:w="6000"/>
+              <w:gridCol w:w="3000"/>
+            </w:tblGrid>
+            <w:tr>
+              <w:tc>
+                <w:tcPr>
+                  <w:tcBorders>
+                    <w:top w:val="none"/>
+                    <w:left w:val="none"/>
+                    <w:bottom w:val="none"/>
+                    <w:right w:val="none"/>
+                  </w:tcBorders>
+                </w:tcPr>
+                <w:p>
+                  <w:pPr>
+                    <w:spacing w:after="60" w:line="240" w:lineRule="auto"/>
+                  </w:pPr>
+                  <w:r>
+                    <w:rPr>
+                      <w:sz w:val="18"/>
+                      <w:rFonts w:ascii="Arial" w:hAnsi="Arial"/>
+                    </w:rPr>
+                    <w:t xml:space="preserve">{{@Logo}}</w:t>
+                  </w:r>
+                </w:p>
+              </w:tc>
+              <w:tc>
+                <w:tcPr>
+                  <w:tcBorders>
+                    <w:top w:val="none"/>
+                    <w:left w:val="none"/>
+                    <w:bottom w:val="none"/>
+                    <w:right w:val="none"/>
+                  </w:tcBorders>
+                </w:tcPr>
+                <w:p>
+                  <w:pPr>
+                    <w:spacing w:after="60" w:line="240" w:lineRule="auto"/>
+                    <w:jc w:val="right"/>
+                  </w:pPr>
+                  <w:r>
+                    <w:rPr>
+                      <w:sz w:val="18"/>
+                      <w:rFonts w:ascii="Arial" w:hAnsi="Arial"/>
+                    </w:rPr>
+                    <w:t xml:space="preserve">{{@Wappen}}</w:t>
+                  </w:r>
+                </w:p>
+              </w:tc>
+            </w:tr>
+          </w:tbl>
           <w:p>
             <w:pPr>
               <w:spacing w:after="60" w:line="240" w:lineRule="auto"/>
@@ -796,7 +846,7 @@
                 <w:sz w:val="20"/>
                 <w:rFonts w:ascii="Arial" w:hAnsi="Arial"/>
               </w:rPr>
-              <w:t xml:space="preserve">{{Autor}}</w:t>
+              <w:t xml:space="preserve">{{Autoren}}</w:t>
             </w:r>
           </w:p>
         </w:tc>
@@ -1051,52 +1101,6 @@
           </w:p>
         </w:tc>
       </w:tr>
-      <w:tr>
-        <w:tc>
-          <w:tcPr>
-            <w:tcBorders>
-              <w:top w:val="none"/>
-              <w:left w:val="none"/>
-              <w:bottom w:val="none"/>
-              <w:right w:val="none"/>
-            </w:tcBorders>
-          </w:tcPr>
-          <w:p>
-            <w:pPr>
-              <w:spacing w:after="60" w:line="240" w:lineRule="auto"/>
-            </w:pPr>
-            <w:r>
-              <w:rPr>
-                <w:sz w:val="20"/>
-                <w:rFonts w:ascii="Arial" w:hAnsi="Arial"/>
-              </w:rPr>
-              <w:t xml:space="preserve">5.</w:t>
-            </w:r>
-          </w:p>
-        </w:tc>
-        <w:tc>
-          <w:tcPr>
-            <w:tcBorders>
-              <w:top w:val="none"/>
-              <w:left w:val="none"/>
-              <w:bottom w:val="none"/>
-              <w:right w:val="none"/>
-            </w:tcBorders>
-          </w:tcPr>
-          <w:p>
-            <w:pPr>
-              <w:spacing w:after="60" w:line="240" w:lineRule="auto"/>
-            </w:pPr>
-            <w:r>
-              <w:rPr>
-                <w:sz w:val="20"/>
-                <w:rFonts w:ascii="Arial" w:hAnsi="Arial"/>
-              </w:rPr>
-              <w:t xml:space="preserve">Rückmeldung / Einverständnis</w:t>
-            </w:r>
-          </w:p>
-        </w:tc>
-      </w:tr>
     </w:tbl>
     <w:p>
       <w:r>
@@ -1131,15 +1135,14 @@
     <w:p>
       <w:pPr>
         <w:spacing w:after="60" w:line="240" w:lineRule="auto"/>
+        <w:jc w:val="center"/>
       </w:pPr>
       <w:r>
         <w:rPr>
-          <w:i/>
-          <w:color w:val="808080"/>
           <w:sz w:val="20"/>
           <w:rFonts w:ascii="Arial" w:hAnsi="Arial"/>
         </w:rPr>
-        <w:t xml:space="preserve">[Hier den Übersichtsplan einfügen: Register „Einfügen" → „Bilder". Diesen Hinweis danach löschen.]</w:t>
+        <w:t xml:space="preserve">{{@Uebersichtsplan}}</w:t>
       </w:r>
     </w:p>
     <w:p>
@@ -1265,41 +1268,41 @@
                 <w:sz w:val="18"/>
                 <w:rFonts w:ascii="Arial" w:hAnsi="Arial"/>
               </w:rPr>
-              <w:t xml:space="preserve">{{Hausnummern}}</w:t>
-            </w:r>
-          </w:p>
-        </w:tc>
-        <w:tc>
-          <w:tcPr>
-            <w:vAlign w:val="center"/>
-          </w:tcPr>
-          <w:p>
-            <w:pPr>
-              <w:spacing w:after="60" w:line="240" w:lineRule="auto"/>
-            </w:pPr>
-            <w:r>
-              <w:rPr>
-                <w:sz w:val="18"/>
-                <w:rFonts w:ascii="Arial" w:hAnsi="Arial"/>
-              </w:rPr>
-              <w:t xml:space="preserve">{{Parzellen}}</w:t>
-            </w:r>
-          </w:p>
-        </w:tc>
-        <w:tc>
-          <w:tcPr>
-            <w:vAlign w:val="center"/>
-          </w:tcPr>
-          <w:p>
-            <w:pPr>
-              <w:spacing w:after="60" w:line="240" w:lineRule="auto"/>
-            </w:pPr>
-            <w:r>
-              <w:rPr>
-                <w:sz w:val="18"/>
-                <w:rFonts w:ascii="Arial" w:hAnsi="Arial"/>
-              </w:rPr>
-              <w:t xml:space="preserve">{{Eigentuemer_Detail}}</w:t>
+              <w:t xml:space="preserve">{{#Eigentuemer}}{{Haus_Nr}}</w:t>
+            </w:r>
+          </w:p>
+        </w:tc>
+        <w:tc>
+          <w:tcPr>
+            <w:vAlign w:val="center"/>
+          </w:tcPr>
+          <w:p>
+            <w:pPr>
+              <w:spacing w:after="60" w:line="240" w:lineRule="auto"/>
+            </w:pPr>
+            <w:r>
+              <w:rPr>
+                <w:sz w:val="18"/>
+                <w:rFonts w:ascii="Arial" w:hAnsi="Arial"/>
+              </w:rPr>
+              <w:t xml:space="preserve">{{Pz_Nr}}</w:t>
+            </w:r>
+          </w:p>
+        </w:tc>
+        <w:tc>
+          <w:tcPr>
+            <w:vAlign w:val="center"/>
+          </w:tcPr>
+          <w:p>
+            <w:pPr>
+              <w:spacing w:after="60" w:line="240" w:lineRule="auto"/>
+            </w:pPr>
+            <w:r>
+              <w:rPr>
+                <w:sz w:val="18"/>
+                <w:rFonts w:ascii="Arial" w:hAnsi="Arial"/>
+              </w:rPr>
+              <w:t xml:space="preserve">{{Eigentuemer_Zelle}}</w:t>
             </w:r>
           </w:p>
         </w:tc>
@@ -2127,72 +2130,24 @@
           </w:p>
         </w:tc>
       </w:tr>
-    </w:tbl>
-    <w:p>
-      <w:pPr>
-        <w:spacing w:after="60" w:line="240" w:lineRule="auto"/>
-      </w:pPr>
-      <w:r>
-        <w:rPr>
-          <w:sz w:val="20"/>
-          <w:rFonts w:ascii="Arial" w:hAnsi="Arial"/>
-        </w:rPr>
-        <w:t xml:space="preserve"/>
-      </w:r>
-    </w:p>
-    <w:p>
-      <w:pPr>
-        <w:spacing w:after="60" w:line="240" w:lineRule="auto"/>
-      </w:pPr>
-      <w:r>
-        <w:rPr>
-          <w:sz w:val="20"/>
-          <w:rFonts w:ascii="Arial" w:hAnsi="Arial"/>
-        </w:rPr>
-        <w:t xml:space="preserve"/>
-      </w:r>
-    </w:p>
-    <w:p>
-      <w:pPr>
-        <w:spacing w:after="60" w:line="240" w:lineRule="auto"/>
-      </w:pPr>
-      <w:r>
-        <w:rPr>
-          <w:b/>
-          <w:sz w:val="24"/>
-          <w:rFonts w:ascii="Arial" w:hAnsi="Arial"/>
-        </w:rPr>
-        <w:t xml:space="preserve">5.  Rückmeldung / Einverständnis Eigentümer</w:t>
-      </w:r>
-    </w:p>
-    <w:p>
-      <w:pPr>
-        <w:spacing w:after="60" w:line="240" w:lineRule="auto"/>
-      </w:pPr>
-      <w:r>
-        <w:rPr>
-          <w:sz w:val="20"/>
-          <w:rFonts w:ascii="Arial" w:hAnsi="Arial"/>
-        </w:rPr>
-        <w:t xml:space="preserve"/>
-      </w:r>
-    </w:p>
-    <w:tbl>
-      <w:tblPr>
-        <w:tblW w:w="5000" w:type="pct"/>
-        <w:tblBorders>
-          <w:top w:val="single" w:color="000000" w:sz="6"/>
-          <w:left w:val="single" w:color="000000" w:sz="6"/>
-          <w:bottom w:val="single" w:color="000000" w:sz="6"/>
-          <w:right w:val="single" w:color="000000" w:sz="6"/>
-          <w:insideH w:val="single" w:color="000000" w:sz="6"/>
-          <w:insideV w:val="single" w:color="000000" w:sz="6"/>
-        </w:tblBorders>
-      </w:tblPr>
-      <w:tblGrid>
-        <w:gridCol w:w="9200"/>
-      </w:tblGrid>
-      <w:tr>
+      <w:tr>
+        <w:tc>
+          <w:tcPr>
+            <w:vAlign w:val="center"/>
+          </w:tcPr>
+          <w:p>
+            <w:pPr>
+              <w:spacing w:after="60" w:line="240" w:lineRule="auto"/>
+            </w:pPr>
+            <w:r>
+              <w:rPr>
+                <w:sz w:val="18"/>
+                <w:rFonts w:ascii="Arial" w:hAnsi="Arial"/>
+              </w:rPr>
+              <w:t xml:space="preserve">Rückmeldung / Einverständnis Eigentümer</w:t>
+            </w:r>
+          </w:p>
+        </w:tc>
         <w:tc>
           <w:tcPr>
             <w:vAlign w:val="center"/>
@@ -2207,25 +2162,6 @@
                 <w:rFonts w:ascii="Arial" w:hAnsi="Arial"/>
               </w:rPr>
               <w:t xml:space="preserve">{{Rueckmeldung}}</w:t>
-            </w:r>
-          </w:p>
-        </w:tc>
-      </w:tr>
-      <w:tr>
-        <w:tc>
-          <w:tcPr>
-            <w:tcW w:w="5000" w:type="pct"/>
-          </w:tcPr>
-          <w:p>
-            <w:pPr>
-              <w:spacing w:after="60" w:line="240" w:lineRule="auto"/>
-            </w:pPr>
-            <w:r>
-              <w:rPr>
-                <w:sz w:val="20"/>
-                <w:rFonts w:ascii="Arial" w:hAnsi="Arial"/>
-              </w:rPr>
-              <w:t xml:space="preserve"/>
             </w:r>
           </w:p>
           <w:p>
@@ -2365,7 +2301,7 @@
       </w:tr>
     </w:tbl>
     <w:sectPr>
-      <w:footerReference xmlns:r="http://schemas.openxmlformats.org/officeDocument/2006/relationships" w:type="default" r:id="R980b9bda46324cdb"/>
+      <w:footerReference xmlns:r="http://schemas.openxmlformats.org/officeDocument/2006/relationships" w:type="default" r:id="R3d274ce0d7cb41a6"/>
       <w:pgSz w:w="11906" w:h="16838"/>
       <w:pgMar w:top="1134" w:right="1134" w:bottom="1134" w:left="1134" w:header="567" w:footer="567" w:gutter="0"/>
     </w:sectPr>

</xml_diff>

<commit_message>
feat(dossier): Leitungen ueber den Namen finden, Schaechte mitnehmen
Die privaten Hausanschluesse fuehrt der Kanton grosstenteils nicht — ihr
Knotenname nennt aber die Parzelle: "439.01-36051" laeuft auf Parzelle 439.
Die Abfrage nutzt jetzt beide Wege und sagt je Leitung, welcher sie gefunden
hat: "beim Kanton" oder "aus dem Leitungsnamen — privat angenommen".

Angeboten wird ausschliesslich, was das Hauptprojekt wirklich fuehrt. Kennt der
Kanton hier weitere Leitungen, erscheint das als Zahl — damit die Luecke
sichtbar ist, ohne dass etwas ins Dossier geraet, das es im Projekt nicht gibt.

Die Schaechte ergeben sich aus den Knotennamen der angehakten Leitungen und
aendern sich mit jedem Haken. Aufgenommen wird nur, was das Projekt als Schacht
fuehrt: ein erfundener Schacht im Brief waere schlimmer als eine kurze Liste.
Sie stehen im Kapitel "Betroffene Leitungen" mit Nummer, Strasse, Zustand und
Kosten.

Co-Authored-By: Claude Opus 5 (1M context) <noreply@anthropic.com>
</commit_message>
<xml_diff>
--- a/Export_Vorlage/Eigentuemerdossier.docx
+++ b/Export_Vorlage/Eigentuemerdossier.docx
@@ -3186,6 +3186,25 @@
       </w:pPr>
       <w:r>
         <w:t xml:space="preserve">{{Haltungen_Summe}}</w:t>
+      </w:r>
+      <w:r>
+        <w:tab/>
+      </w:r>
+      <w:r>
+        <w:t/>
+      </w:r>
+    </w:p>
+    <w:p>
+      <w:pPr>
+        <w:tabs>
+          <w:tab w:val="left" w:pos="3402"/>
+        </w:tabs>
+        <w:rPr>
+          <w:color w:val="FF0000"/>
+        </w:rPr>
+      </w:pPr>
+      <w:r>
+        <w:t xml:space="preserve">{{Schaechte_Text}}</w:t>
       </w:r>
       <w:r>
         <w:tab/>

</xml_diff>